<commit_message>
IS Work in progress
Done draft L1 diagram in KiCad and some work on the IS L1 docx
</commit_message>
<xml_diff>
--- a/CPU Design/L1IsDesign.docx
+++ b/CPU Design/L1IsDesign.docx
@@ -2005,6 +2005,8 @@
           <w:lang w:eastAsia="en-GB"/>
         </w:rPr>
       </w:pPr>
+      <w:bookmarkStart w:id="6" w:name="CurrentEditPos"/>
+      <w:bookmarkEnd w:id="6"/>
       <w:r>
         <w:rPr>
           <w:lang w:eastAsia="en-GB"/>
@@ -2074,7 +2076,7 @@
         <w:keepNext/>
         <w:jc w:val="center"/>
       </w:pPr>
-      <w:bookmarkStart w:id="6" w:name="_Ref232761378"/>
+      <w:bookmarkStart w:id="7" w:name="_Ref232761378"/>
       <w:r>
         <w:t xml:space="preserve">Table </w:t>
       </w:r>
@@ -2086,7 +2088,7 @@
           <w:t>1</w:t>
         </w:r>
       </w:fldSimple>
-      <w:bookmarkEnd w:id="6"/>
+      <w:bookmarkEnd w:id="7"/>
       <w:r>
         <w:t>:   ALU Inputs and Outputs</w:t>
       </w:r>
@@ -2130,17 +2132,27 @@
               </w:rPr>
               <w:t xml:space="preserve">Ref </w:t>
             </w:r>
-            <w:fldSimple w:instr=" REF RefCpuDesign \r \h  \* MERGEFORMAT ">
-              <w:r>
-                <w:rPr>
-                  <w:b/>
-                  <w:sz w:val="20"/>
-                  <w:szCs w:val="20"/>
-                  <w:lang w:eastAsia="en-GB"/>
-                </w:rPr>
-                <w:t>2</w:t>
-              </w:r>
-            </w:fldSimple>
+            <w:r>
+              <w:fldChar w:fldCharType="begin"/>
+            </w:r>
+            <w:r>
+              <w:instrText xml:space="preserve"> REF RefCpuDesign \r \h  \* MERGEFORMAT </w:instrText>
+            </w:r>
+            <w:r>
+              <w:fldChar w:fldCharType="separate"/>
+            </w:r>
+            <w:r>
+              <w:rPr>
+                <w:b/>
+                <w:sz w:val="20"/>
+                <w:szCs w:val="20"/>
+                <w:lang w:eastAsia="en-GB"/>
+              </w:rPr>
+              <w:t>2</w:t>
+            </w:r>
+            <w:r>
+              <w:fldChar w:fldCharType="end"/>
+            </w:r>
             <w:r>
               <w:rPr>
                 <w:b/>
@@ -2296,7 +2308,15 @@
                 <w:szCs w:val="20"/>
                 <w:lang w:eastAsia="en-GB"/>
               </w:rPr>
-              <w:t>FLAG_S</w:t>
+              <w:t>FLA</w:t>
+            </w:r>
+            <w:r>
+              <w:rPr>
+                <w:sz w:val="20"/>
+                <w:szCs w:val="20"/>
+                <w:lang w:eastAsia="en-GB"/>
+              </w:rPr>
+              <w:t>GS BUS</w:t>
             </w:r>
           </w:p>
         </w:tc>
@@ -2318,291 +2338,7 @@
                 <w:szCs w:val="20"/>
                 <w:lang w:eastAsia="en-GB"/>
               </w:rPr>
-              <w:t>FLAG_S</w:t>
-            </w:r>
-          </w:p>
-        </w:tc>
-        <w:tc>
-          <w:tcPr>
-            <w:tcW w:w="1553" w:type="dxa"/>
-          </w:tcPr>
-          <w:p>
-            <w:pPr>
-              <w:rPr>
-                <w:sz w:val="20"/>
-                <w:szCs w:val="20"/>
-                <w:lang w:eastAsia="en-GB"/>
-              </w:rPr>
-            </w:pPr>
-            <w:r>
-              <w:rPr>
-                <w:sz w:val="20"/>
-                <w:szCs w:val="20"/>
-                <w:lang w:eastAsia="en-GB"/>
-              </w:rPr>
-              <w:t>Input</w:t>
-            </w:r>
-          </w:p>
-        </w:tc>
-      </w:tr>
-      <w:tr>
-        <w:trPr>
-          <w:jc w:val="center"/>
-        </w:trPr>
-        <w:tc>
-          <w:tcPr>
-            <w:tcW w:w="2008" w:type="dxa"/>
-          </w:tcPr>
-          <w:p>
-            <w:pPr>
-              <w:rPr>
-                <w:sz w:val="20"/>
-                <w:szCs w:val="20"/>
-                <w:lang w:eastAsia="en-GB"/>
-              </w:rPr>
-            </w:pPr>
-            <w:r>
-              <w:rPr>
-                <w:sz w:val="20"/>
-                <w:szCs w:val="20"/>
-                <w:lang w:eastAsia="en-GB"/>
-              </w:rPr>
-              <w:t>FLAG_V</w:t>
-            </w:r>
-          </w:p>
-        </w:tc>
-        <w:tc>
-          <w:tcPr>
-            <w:tcW w:w="1294" w:type="dxa"/>
-          </w:tcPr>
-          <w:p>
-            <w:pPr>
-              <w:rPr>
-                <w:sz w:val="20"/>
-                <w:szCs w:val="20"/>
-                <w:lang w:eastAsia="en-GB"/>
-              </w:rPr>
-            </w:pPr>
-            <w:r>
-              <w:rPr>
-                <w:sz w:val="20"/>
-                <w:szCs w:val="20"/>
-                <w:lang w:eastAsia="en-GB"/>
-              </w:rPr>
-              <w:t>FLAG_V</w:t>
-            </w:r>
-          </w:p>
-        </w:tc>
-        <w:tc>
-          <w:tcPr>
-            <w:tcW w:w="1553" w:type="dxa"/>
-          </w:tcPr>
-          <w:p>
-            <w:pPr>
-              <w:rPr>
-                <w:sz w:val="20"/>
-                <w:szCs w:val="20"/>
-                <w:lang w:eastAsia="en-GB"/>
-              </w:rPr>
-            </w:pPr>
-            <w:r>
-              <w:rPr>
-                <w:sz w:val="20"/>
-                <w:szCs w:val="20"/>
-                <w:lang w:eastAsia="en-GB"/>
-              </w:rPr>
-              <w:t>Input</w:t>
-            </w:r>
-          </w:p>
-        </w:tc>
-      </w:tr>
-      <w:tr>
-        <w:trPr>
-          <w:jc w:val="center"/>
-        </w:trPr>
-        <w:tc>
-          <w:tcPr>
-            <w:tcW w:w="2008" w:type="dxa"/>
-          </w:tcPr>
-          <w:p>
-            <w:pPr>
-              <w:rPr>
-                <w:sz w:val="20"/>
-                <w:szCs w:val="20"/>
-                <w:lang w:val="en-US" w:eastAsia="en-GB"/>
-              </w:rPr>
-            </w:pPr>
-            <w:r>
-              <w:rPr>
-                <w:sz w:val="20"/>
-                <w:szCs w:val="20"/>
-                <w:lang w:eastAsia="en-GB"/>
-              </w:rPr>
-              <w:t>FLAG_N</w:t>
-            </w:r>
-          </w:p>
-        </w:tc>
-        <w:tc>
-          <w:tcPr>
-            <w:tcW w:w="1294" w:type="dxa"/>
-          </w:tcPr>
-          <w:p>
-            <w:pPr>
-              <w:rPr>
-                <w:sz w:val="20"/>
-                <w:szCs w:val="20"/>
-                <w:lang w:eastAsia="en-GB"/>
-              </w:rPr>
-            </w:pPr>
-            <w:r>
-              <w:rPr>
-                <w:sz w:val="20"/>
-                <w:szCs w:val="20"/>
-                <w:lang w:eastAsia="en-GB"/>
-              </w:rPr>
-              <w:t>FLAG_N</w:t>
-            </w:r>
-          </w:p>
-        </w:tc>
-        <w:tc>
-          <w:tcPr>
-            <w:tcW w:w="1553" w:type="dxa"/>
-          </w:tcPr>
-          <w:p>
-            <w:pPr>
-              <w:rPr>
-                <w:sz w:val="20"/>
-                <w:szCs w:val="20"/>
-                <w:lang w:eastAsia="en-GB"/>
-              </w:rPr>
-            </w:pPr>
-            <w:r>
-              <w:rPr>
-                <w:sz w:val="20"/>
-                <w:szCs w:val="20"/>
-                <w:lang w:eastAsia="en-GB"/>
-              </w:rPr>
-              <w:t>Input</w:t>
-            </w:r>
-          </w:p>
-        </w:tc>
-      </w:tr>
-      <w:tr>
-        <w:trPr>
-          <w:jc w:val="center"/>
-        </w:trPr>
-        <w:tc>
-          <w:tcPr>
-            <w:tcW w:w="2008" w:type="dxa"/>
-          </w:tcPr>
-          <w:p>
-            <w:pPr>
-              <w:rPr>
-                <w:sz w:val="20"/>
-                <w:szCs w:val="20"/>
-                <w:lang w:eastAsia="en-GB"/>
-              </w:rPr>
-            </w:pPr>
-            <w:r>
-              <w:rPr>
-                <w:sz w:val="20"/>
-                <w:szCs w:val="20"/>
-                <w:lang w:eastAsia="en-GB"/>
-              </w:rPr>
-              <w:t>FLAG_Z</w:t>
-            </w:r>
-          </w:p>
-        </w:tc>
-        <w:tc>
-          <w:tcPr>
-            <w:tcW w:w="1294" w:type="dxa"/>
-          </w:tcPr>
-          <w:p>
-            <w:pPr>
-              <w:rPr>
-                <w:sz w:val="20"/>
-                <w:szCs w:val="20"/>
-                <w:lang w:eastAsia="en-GB"/>
-              </w:rPr>
-            </w:pPr>
-            <w:r>
-              <w:rPr>
-                <w:sz w:val="20"/>
-                <w:szCs w:val="20"/>
-                <w:lang w:eastAsia="en-GB"/>
-              </w:rPr>
-              <w:t>FLAG_Z</w:t>
-            </w:r>
-          </w:p>
-        </w:tc>
-        <w:tc>
-          <w:tcPr>
-            <w:tcW w:w="1553" w:type="dxa"/>
-          </w:tcPr>
-          <w:p>
-            <w:pPr>
-              <w:rPr>
-                <w:sz w:val="20"/>
-                <w:szCs w:val="20"/>
-                <w:lang w:eastAsia="en-GB"/>
-              </w:rPr>
-            </w:pPr>
-            <w:r>
-              <w:rPr>
-                <w:sz w:val="20"/>
-                <w:szCs w:val="20"/>
-                <w:lang w:eastAsia="en-GB"/>
-              </w:rPr>
-              <w:t>Input</w:t>
-            </w:r>
-          </w:p>
-        </w:tc>
-      </w:tr>
-      <w:tr>
-        <w:trPr>
-          <w:jc w:val="center"/>
-        </w:trPr>
-        <w:tc>
-          <w:tcPr>
-            <w:tcW w:w="2008" w:type="dxa"/>
-          </w:tcPr>
-          <w:p>
-            <w:pPr>
-              <w:rPr>
-                <w:sz w:val="20"/>
-                <w:szCs w:val="20"/>
-                <w:lang w:eastAsia="en-GB"/>
-              </w:rPr>
-            </w:pPr>
-            <w:r>
-              <w:rPr>
-                <w:sz w:val="20"/>
-                <w:szCs w:val="20"/>
-                <w:lang w:eastAsia="en-GB"/>
-              </w:rPr>
-              <w:t>FLAG_C</w:t>
-            </w:r>
-          </w:p>
-        </w:tc>
-        <w:tc>
-          <w:tcPr>
-            <w:tcW w:w="1294" w:type="dxa"/>
-          </w:tcPr>
-          <w:p>
-            <w:pPr>
-              <w:rPr>
-                <w:sz w:val="20"/>
-                <w:szCs w:val="20"/>
-                <w:lang w:eastAsia="en-GB"/>
-              </w:rPr>
-            </w:pPr>
-            <w:r>
-              <w:rPr>
-                <w:sz w:val="20"/>
-                <w:szCs w:val="20"/>
-                <w:lang w:eastAsia="en-GB"/>
-              </w:rPr>
-              <w:t>FLAG_C</w:t>
+              <w:t>FLAGS</w:t>
             </w:r>
           </w:p>
         </w:tc>
@@ -4078,8 +3814,6 @@
           <w:lang w:eastAsia="en-GB"/>
         </w:rPr>
       </w:pPr>
-      <w:bookmarkStart w:id="7" w:name="CurrentEditPos"/>
-      <w:bookmarkEnd w:id="7"/>
       <w:r>
         <w:rPr>
           <w:lang w:eastAsia="en-GB"/>
@@ -7219,21 +6953,63 @@
         <w:rPr>
           <w:lang w:eastAsia="en-GB"/>
         </w:rPr>
-        <w:t>IS has to do SUB Ra,Rb but not store result in Ra. Would be convenient for IS if SUB mode was in bits 10 to 8.</w:t>
+        <w:t>IS has to do SUB Ra</w:t>
+      </w:r>
+      <w:proofErr w:type="gramStart"/>
+      <w:r>
+        <w:rPr>
+          <w:lang w:eastAsia="en-GB"/>
+        </w:rPr>
+        <w:t>,Rb</w:t>
+      </w:r>
+      <w:proofErr w:type="gramEnd"/>
+      <w:r>
+        <w:rPr>
+          <w:lang w:eastAsia="en-GB"/>
+        </w:rPr>
+        <w:t xml:space="preserve"> but not store result in Ra. Would be convenient for IS if SUB mode was in bits 10 to 8.</w:t>
       </w:r>
     </w:p>
     <w:p>
       <w:pPr>
+        <w:spacing w:before="60"/>
+        <w:rPr>
+          <w:lang w:eastAsia="en-GB"/>
+        </w:rPr>
+      </w:pPr>
+    </w:p>
+    <w:p>
+      <w:pPr>
+        <w:rPr>
+          <w:rFonts w:asciiTheme="majorHAnsi" w:eastAsiaTheme="majorEastAsia" w:hAnsiTheme="majorHAnsi" w:cstheme="majorBidi"/>
+          <w:b/>
+          <w:bCs/>
+          <w:color w:val="4F81BD" w:themeColor="accent1"/>
+          <w:sz w:val="26"/>
+          <w:szCs w:val="26"/>
+          <w:lang w:eastAsia="en-GB"/>
+        </w:rPr>
+      </w:pPr>
+      <w:bookmarkStart w:id="9" w:name="_Toc232842930"/>
+      <w:r>
+        <w:rPr>
+          <w:lang w:eastAsia="en-GB"/>
+        </w:rPr>
+        <w:br w:type="page"/>
+      </w:r>
+    </w:p>
+    <w:p>
+      <w:pPr>
         <w:pStyle w:val="Heading2"/>
         <w:rPr>
           <w:lang w:eastAsia="en-GB"/>
         </w:rPr>
       </w:pPr>
-      <w:bookmarkStart w:id="9" w:name="_Toc232842930"/>
-      <w:r>
-        <w:rPr>
-          <w:lang w:eastAsia="en-GB"/>
-        </w:rPr>
+      <w:r>
+        <w:rPr>
+          <w:lang w:eastAsia="en-GB"/>
+        </w:rPr>
+        <w:lastRenderedPageBreak/>
         <w:t>IS</w:t>
       </w:r>
       <w:r>
@@ -7317,16 +7093,57 @@
           <w:noProof/>
           <w:lang w:eastAsia="en-GB"/>
         </w:rPr>
-        <w:t>&lt;tbd&gt;</w:t>
+        <w:drawing>
+          <wp:inline distT="0" distB="0" distL="0" distR="0">
+            <wp:extent cx="5731510" cy="3254929"/>
+            <wp:effectExtent l="19050" t="0" r="2540" b="0"/>
+            <wp:docPr id="4" name="Picture 4"/>
+            <wp:cNvGraphicFramePr>
+              <a:graphicFrameLocks xmlns:a="http://schemas.openxmlformats.org/drawingml/2006/main" noChangeAspect="1"/>
+            </wp:cNvGraphicFramePr>
+            <a:graphic xmlns:a="http://schemas.openxmlformats.org/drawingml/2006/main">
+              <a:graphicData uri="http://schemas.openxmlformats.org/drawingml/2006/picture">
+                <pic:pic xmlns:pic="http://schemas.openxmlformats.org/drawingml/2006/picture">
+                  <pic:nvPicPr>
+                    <pic:cNvPr id="0" name="Picture 4"/>
+                    <pic:cNvPicPr>
+                      <a:picLocks noChangeAspect="1" noChangeArrowheads="1"/>
+                    </pic:cNvPicPr>
+                  </pic:nvPicPr>
+                  <pic:blipFill>
+                    <a:blip r:embed="rId12" cstate="print"/>
+                    <a:srcRect/>
+                    <a:stretch>
+                      <a:fillRect/>
+                    </a:stretch>
+                  </pic:blipFill>
+                  <pic:spPr bwMode="auto">
+                    <a:xfrm>
+                      <a:off x="0" y="0"/>
+                      <a:ext cx="5731510" cy="3254929"/>
+                    </a:xfrm>
+                    <a:prstGeom prst="rect">
+                      <a:avLst/>
+                    </a:prstGeom>
+                    <a:noFill/>
+                    <a:ln w="9525">
+                      <a:noFill/>
+                      <a:miter lim="800000"/>
+                      <a:headEnd/>
+                      <a:tailEnd/>
+                    </a:ln>
+                  </pic:spPr>
+                </pic:pic>
+              </a:graphicData>
+            </a:graphic>
+          </wp:inline>
+        </w:drawing>
       </w:r>
     </w:p>
     <w:p>
       <w:pPr>
         <w:pStyle w:val="Caption"/>
         <w:jc w:val="center"/>
-        <w:rPr>
-          <w:lang w:eastAsia="en-GB"/>
-        </w:rPr>
       </w:pPr>
       <w:bookmarkStart w:id="10" w:name="_Ref232762527"/>
       <w:bookmarkStart w:id="11" w:name="_Toc232842935"/>
@@ -7346,7 +7163,7 @@
         <w:t xml:space="preserve">:   </w:t>
       </w:r>
       <w:r>
-        <w:t>TBD</w:t>
+        <w:t>IS</w:t>
       </w:r>
       <w:r>
         <w:t xml:space="preserve"> </w:t>
@@ -7360,271 +7177,152 @@
       <w:bookmarkEnd w:id="11"/>
     </w:p>
     <w:p>
-      <w:pPr>
-        <w:pStyle w:val="Heading1"/>
-        <w:rPr>
-          <w:lang w:eastAsia="en-GB"/>
-        </w:rPr>
-      </w:pPr>
-      <w:bookmarkStart w:id="12" w:name="_Toc232842931"/>
-      <w:r>
-        <w:rPr>
-          <w:lang w:eastAsia="en-GB"/>
-        </w:rPr>
-        <w:t xml:space="preserve">Details for Each of the Blocks Shown in </w:t>
-      </w:r>
-      <w:r>
-        <w:rPr>
-          <w:lang w:eastAsia="en-GB"/>
-        </w:rPr>
-        <w:fldChar w:fldCharType="begin"/>
-      </w:r>
-      <w:r>
-        <w:rPr>
-          <w:lang w:eastAsia="en-GB"/>
-        </w:rPr>
-        <w:instrText xml:space="preserve"> REF _Ref232762527 \h </w:instrText>
-      </w:r>
-      <w:r>
-        <w:rPr>
-          <w:lang w:eastAsia="en-GB"/>
-        </w:rPr>
-      </w:r>
-      <w:r>
-        <w:rPr>
-          <w:lang w:eastAsia="en-GB"/>
-        </w:rPr>
-        <w:fldChar w:fldCharType="separate"/>
-      </w:r>
-      <w:r>
-        <w:t xml:space="preserve">Figure </w:t>
-      </w:r>
-      <w:r>
-        <w:rPr>
-          <w:noProof/>
-        </w:rPr>
-        <w:t>2</w:t>
-      </w:r>
-      <w:bookmarkEnd w:id="12"/>
-      <w:r>
-        <w:rPr>
-          <w:lang w:eastAsia="en-GB"/>
-        </w:rPr>
-        <w:fldChar w:fldCharType="end"/>
+      <w:r>
+        <w:t>Snags &lt;</w:t>
+      </w:r>
+      <w:proofErr w:type="spellStart"/>
+      <w:proofErr w:type="gramStart"/>
+      <w:r>
+        <w:t>tbd</w:t>
+      </w:r>
+      <w:proofErr w:type="spellEnd"/>
+      <w:proofErr w:type="gramEnd"/>
+      <w:r>
+        <w:t>&gt;</w:t>
       </w:r>
     </w:p>
     <w:p>
       <w:pPr>
-        <w:rPr>
-          <w:lang w:eastAsia="en-GB"/>
-        </w:rPr>
-      </w:pPr>
-      <w:r>
-        <w:rPr>
-          <w:lang w:eastAsia="en-GB"/>
-        </w:rPr>
-        <w:t xml:space="preserve">The following sub sections, one per block shown in </w:t>
-      </w:r>
-      <w:r>
-        <w:rPr>
-          <w:lang w:eastAsia="en-GB"/>
-        </w:rPr>
-        <w:fldChar w:fldCharType="begin"/>
-      </w:r>
-      <w:r>
-        <w:rPr>
-          <w:lang w:eastAsia="en-GB"/>
-        </w:rPr>
-        <w:instrText xml:space="preserve"> REF _Ref232762527 \h </w:instrText>
-      </w:r>
-      <w:r>
-        <w:rPr>
-          <w:lang w:eastAsia="en-GB"/>
-        </w:rPr>
-      </w:r>
-      <w:r>
-        <w:rPr>
-          <w:lang w:eastAsia="en-GB"/>
-        </w:rPr>
-        <w:fldChar w:fldCharType="separate"/>
-      </w:r>
-      <w:r>
-        <w:t xml:space="preserve">Figure </w:t>
-      </w:r>
-      <w:r>
-        <w:rPr>
-          <w:noProof/>
-        </w:rPr>
-        <w:t>2</w:t>
-      </w:r>
-      <w:r>
-        <w:rPr>
-          <w:lang w:eastAsia="en-GB"/>
-        </w:rPr>
-        <w:fldChar w:fldCharType="end"/>
-      </w:r>
-      <w:r>
-        <w:rPr>
-          <w:lang w:eastAsia="en-GB"/>
-        </w:rPr>
-        <w:t>, define the function of each block.</w:t>
+        <w:pStyle w:val="ListParagraph"/>
+        <w:numPr>
+          <w:ilvl w:val="0"/>
+          <w:numId w:val="27"/>
+        </w:numPr>
+      </w:pPr>
+      <w:r>
+        <w:t>RAM Address Control:</w:t>
       </w:r>
     </w:p>
     <w:p>
       <w:pPr>
-        <w:pStyle w:val="Heading2"/>
-        <w:rPr>
-          <w:lang w:eastAsia="en-GB"/>
-        </w:rPr>
-      </w:pPr>
-      <w:bookmarkStart w:id="13" w:name="_Toc232842932"/>
-      <w:r>
-        <w:rPr>
-          <w:lang w:eastAsia="en-GB"/>
-        </w:rPr>
-        <w:t>&lt;</w:t>
-      </w:r>
-      <w:proofErr w:type="spellStart"/>
-      <w:proofErr w:type="gramStart"/>
-      <w:r>
-        <w:rPr>
-          <w:lang w:eastAsia="en-GB"/>
-        </w:rPr>
-        <w:t>tbd</w:t>
-      </w:r>
-      <w:proofErr w:type="spellEnd"/>
-      <w:proofErr w:type="gramEnd"/>
-      <w:r>
-        <w:rPr>
-          <w:lang w:eastAsia="en-GB"/>
-        </w:rPr>
-        <w:t>&gt;</w:t>
-      </w:r>
-      <w:bookmarkEnd w:id="13"/>
+        <w:pStyle w:val="ListParagraph"/>
+        <w:numPr>
+          <w:ilvl w:val="1"/>
+          <w:numId w:val="27"/>
+        </w:numPr>
+      </w:pPr>
+      <w:r>
+        <w:t>When AS_ALUO is selected, the ALU output will be on the data bus</w:t>
+      </w:r>
     </w:p>
     <w:p>
       <w:pPr>
-        <w:rPr>
-          <w:lang w:eastAsia="en-GB"/>
-        </w:rPr>
-      </w:pPr>
-      <w:r>
-        <w:rPr>
-          <w:lang w:eastAsia="en-GB"/>
-        </w:rPr>
-        <w:t xml:space="preserve">The function of this block is to </w:t>
-      </w:r>
-      <w:r>
-        <w:rPr>
-          <w:lang w:eastAsia="en-GB"/>
-        </w:rPr>
-        <w:t>&lt;</w:t>
-      </w:r>
-      <w:proofErr w:type="spellStart"/>
-      <w:proofErr w:type="gramStart"/>
-      <w:r>
-        <w:rPr>
-          <w:lang w:eastAsia="en-GB"/>
-        </w:rPr>
-        <w:t>tbd</w:t>
-      </w:r>
-      <w:proofErr w:type="spellEnd"/>
-      <w:proofErr w:type="gramEnd"/>
-      <w:r>
-        <w:rPr>
-          <w:lang w:eastAsia="en-GB"/>
-        </w:rPr>
-        <w:t>&gt;</w:t>
+        <w:pStyle w:val="ListParagraph"/>
+        <w:numPr>
+          <w:ilvl w:val="1"/>
+          <w:numId w:val="27"/>
+        </w:numPr>
+      </w:pPr>
+      <w:r>
+        <w:t>When the ALU output is on the data bus</w:t>
+      </w:r>
+      <w:r>
+        <w:t xml:space="preserve"> RAM data can’t be too</w:t>
       </w:r>
     </w:p>
     <w:p>
       <w:pPr>
-        <w:rPr>
-          <w:lang w:eastAsia="en-GB"/>
-        </w:rPr>
-      </w:pPr>
-      <w:r>
-        <w:rPr>
-          <w:lang w:eastAsia="en-GB"/>
-        </w:rPr>
-        <w:t>&lt;</w:t>
-      </w:r>
+        <w:pStyle w:val="ListParagraph"/>
+        <w:numPr>
+          <w:ilvl w:val="1"/>
+          <w:numId w:val="27"/>
+        </w:numPr>
+      </w:pPr>
       <w:proofErr w:type="spellStart"/>
-      <w:proofErr w:type="gramStart"/>
-      <w:r>
-        <w:rPr>
-          <w:lang w:eastAsia="en-GB"/>
-        </w:rPr>
+      <w:r>
+        <w:t>Soluion</w:t>
+      </w:r>
+      <w:proofErr w:type="spellEnd"/>
+      <w:r>
+        <w:t xml:space="preserve"> &lt;</w:t>
+      </w:r>
+      <w:proofErr w:type="spellStart"/>
+      <w:r>
         <w:t>tbd</w:t>
       </w:r>
       <w:proofErr w:type="spellEnd"/>
-      <w:proofErr w:type="gramEnd"/>
-      <w:r>
-        <w:rPr>
-          <w:lang w:eastAsia="en-GB"/>
-        </w:rPr>
-        <w:t xml:space="preserve"> which is it&gt;</w:t>
+      <w:r>
+        <w:t>&gt;</w:t>
       </w:r>
     </w:p>
     <w:p>
       <w:pPr>
-        <w:rPr>
-          <w:lang w:eastAsia="en-GB"/>
-        </w:rPr>
-      </w:pPr>
-      <w:bookmarkStart w:id="14" w:name="SufficientInfo"/>
-      <w:r>
-        <w:rPr>
-          <w:lang w:eastAsia="en-GB"/>
-        </w:rPr>
-        <w:t xml:space="preserve">This should be sufficient information for producing a schematic diagram for this part of the ALU without needing any further level 2 </w:t>
-      </w:r>
-      <w:proofErr w:type="gramStart"/>
-      <w:r>
-        <w:rPr>
-          <w:lang w:eastAsia="en-GB"/>
-        </w:rPr>
-        <w:t>design</w:t>
-      </w:r>
-      <w:bookmarkEnd w:id="14"/>
-      <w:proofErr w:type="gramEnd"/>
-      <w:r>
-        <w:rPr>
-          <w:lang w:eastAsia="en-GB"/>
-        </w:rPr>
-        <w:t>.</w:t>
+        <w:pStyle w:val="ListParagraph"/>
+        <w:numPr>
+          <w:ilvl w:val="2"/>
+          <w:numId w:val="27"/>
+        </w:numPr>
+      </w:pPr>
+      <w:r>
+        <w:t>RAM address control has to latch ALU OUTPUT?</w:t>
       </w:r>
     </w:p>
     <w:p>
-      <w:pPr>
-        <w:rPr>
-          <w:lang w:eastAsia="en-GB"/>
-        </w:rPr>
-      </w:pPr>
-      <w:bookmarkStart w:id="15" w:name="ComplexInfo"/>
-      <w:r>
-        <w:rPr>
-          <w:color w:val="FF0000"/>
-          <w:lang w:eastAsia="en-GB"/>
-        </w:rPr>
-        <w:lastRenderedPageBreak/>
-        <w:t xml:space="preserve">This complex block will need a level 2 block diagram and further text to define the function of each block on that level 2 </w:t>
-      </w:r>
-      <w:proofErr w:type="gramStart"/>
-      <w:r>
-        <w:rPr>
-          <w:color w:val="FF0000"/>
-          <w:lang w:eastAsia="en-GB"/>
-        </w:rPr>
-        <w:t>diagram</w:t>
-      </w:r>
-      <w:bookmarkEnd w:id="15"/>
-      <w:proofErr w:type="gramEnd"/>
-      <w:r>
-        <w:rPr>
-          <w:lang w:eastAsia="en-GB"/>
-        </w:rPr>
-        <w:t>.</w:t>
+      <w:r>
+        <w:t>Below is filtered on AS_ALUO = H, only happens for POP Ra and RET</w:t>
+      </w:r>
+    </w:p>
+    <w:p>
+      <w:r>
+        <w:rPr>
+          <w:noProof/>
+          <w:lang w:eastAsia="en-GB"/>
+        </w:rPr>
+        <w:drawing>
+          <wp:inline distT="0" distB="0" distL="0" distR="0">
+            <wp:extent cx="5731510" cy="775439"/>
+            <wp:effectExtent l="19050" t="0" r="2540" b="0"/>
+            <wp:docPr id="7" name="Picture 7"/>
+            <wp:cNvGraphicFramePr>
+              <a:graphicFrameLocks xmlns:a="http://schemas.openxmlformats.org/drawingml/2006/main" noChangeAspect="1"/>
+            </wp:cNvGraphicFramePr>
+            <a:graphic xmlns:a="http://schemas.openxmlformats.org/drawingml/2006/main">
+              <a:graphicData uri="http://schemas.openxmlformats.org/drawingml/2006/picture">
+                <pic:pic xmlns:pic="http://schemas.openxmlformats.org/drawingml/2006/picture">
+                  <pic:nvPicPr>
+                    <pic:cNvPr id="0" name="Picture 7"/>
+                    <pic:cNvPicPr>
+                      <a:picLocks noChangeAspect="1" noChangeArrowheads="1"/>
+                    </pic:cNvPicPr>
+                  </pic:nvPicPr>
+                  <pic:blipFill>
+                    <a:blip r:embed="rId13" cstate="print"/>
+                    <a:srcRect/>
+                    <a:stretch>
+                      <a:fillRect/>
+                    </a:stretch>
+                  </pic:blipFill>
+                  <pic:spPr bwMode="auto">
+                    <a:xfrm>
+                      <a:off x="0" y="0"/>
+                      <a:ext cx="5731510" cy="775439"/>
+                    </a:xfrm>
+                    <a:prstGeom prst="rect">
+                      <a:avLst/>
+                    </a:prstGeom>
+                    <a:noFill/>
+                    <a:ln w="9525">
+                      <a:noFill/>
+                      <a:miter lim="800000"/>
+                      <a:headEnd/>
+                      <a:tailEnd/>
+                    </a:ln>
+                  </pic:spPr>
+                </pic:pic>
+              </a:graphicData>
+            </a:graphic>
+          </wp:inline>
+        </w:drawing>
       </w:r>
     </w:p>
     <w:p>
@@ -7639,7 +7337,262 @@
           <w:lang w:eastAsia="en-GB"/>
         </w:rPr>
       </w:pPr>
-      <w:bookmarkStart w:id="16" w:name="_Ref172648415"/>
+      <w:bookmarkStart w:id="12" w:name="_Toc232842931"/>
+      <w:r>
+        <w:rPr>
+          <w:lang w:eastAsia="en-GB"/>
+        </w:rPr>
+        <w:br w:type="page"/>
+      </w:r>
+    </w:p>
+    <w:p>
+      <w:pPr>
+        <w:pStyle w:val="Heading1"/>
+        <w:rPr>
+          <w:lang w:eastAsia="en-GB"/>
+        </w:rPr>
+      </w:pPr>
+      <w:r>
+        <w:rPr>
+          <w:lang w:eastAsia="en-GB"/>
+        </w:rPr>
+        <w:lastRenderedPageBreak/>
+        <w:t xml:space="preserve">Details for Each of the Blocks Shown in </w:t>
+      </w:r>
+      <w:r>
+        <w:rPr>
+          <w:lang w:eastAsia="en-GB"/>
+        </w:rPr>
+        <w:fldChar w:fldCharType="begin"/>
+      </w:r>
+      <w:r>
+        <w:rPr>
+          <w:lang w:eastAsia="en-GB"/>
+        </w:rPr>
+        <w:instrText xml:space="preserve"> REF _Ref232762527 \h </w:instrText>
+      </w:r>
+      <w:r>
+        <w:rPr>
+          <w:lang w:eastAsia="en-GB"/>
+        </w:rPr>
+      </w:r>
+      <w:r>
+        <w:rPr>
+          <w:lang w:eastAsia="en-GB"/>
+        </w:rPr>
+        <w:fldChar w:fldCharType="separate"/>
+      </w:r>
+      <w:r>
+        <w:t xml:space="preserve">Figure </w:t>
+      </w:r>
+      <w:r>
+        <w:rPr>
+          <w:noProof/>
+        </w:rPr>
+        <w:t>2</w:t>
+      </w:r>
+      <w:bookmarkEnd w:id="12"/>
+      <w:r>
+        <w:rPr>
+          <w:lang w:eastAsia="en-GB"/>
+        </w:rPr>
+        <w:fldChar w:fldCharType="end"/>
+      </w:r>
+    </w:p>
+    <w:p>
+      <w:pPr>
+        <w:rPr>
+          <w:lang w:eastAsia="en-GB"/>
+        </w:rPr>
+      </w:pPr>
+      <w:r>
+        <w:rPr>
+          <w:lang w:eastAsia="en-GB"/>
+        </w:rPr>
+        <w:t xml:space="preserve">The following sub sections, one per block shown in </w:t>
+      </w:r>
+      <w:r>
+        <w:rPr>
+          <w:lang w:eastAsia="en-GB"/>
+        </w:rPr>
+        <w:fldChar w:fldCharType="begin"/>
+      </w:r>
+      <w:r>
+        <w:rPr>
+          <w:lang w:eastAsia="en-GB"/>
+        </w:rPr>
+        <w:instrText xml:space="preserve"> REF _Ref232762527 \h </w:instrText>
+      </w:r>
+      <w:r>
+        <w:rPr>
+          <w:lang w:eastAsia="en-GB"/>
+        </w:rPr>
+      </w:r>
+      <w:r>
+        <w:rPr>
+          <w:lang w:eastAsia="en-GB"/>
+        </w:rPr>
+        <w:fldChar w:fldCharType="separate"/>
+      </w:r>
+      <w:r>
+        <w:t xml:space="preserve">Figure </w:t>
+      </w:r>
+      <w:r>
+        <w:rPr>
+          <w:noProof/>
+        </w:rPr>
+        <w:t>2</w:t>
+      </w:r>
+      <w:r>
+        <w:rPr>
+          <w:lang w:eastAsia="en-GB"/>
+        </w:rPr>
+        <w:fldChar w:fldCharType="end"/>
+      </w:r>
+      <w:r>
+        <w:rPr>
+          <w:lang w:eastAsia="en-GB"/>
+        </w:rPr>
+        <w:t>, define the function of each block.</w:t>
+      </w:r>
+    </w:p>
+    <w:p>
+      <w:pPr>
+        <w:pStyle w:val="Heading2"/>
+        <w:rPr>
+          <w:lang w:eastAsia="en-GB"/>
+        </w:rPr>
+      </w:pPr>
+      <w:r>
+        <w:rPr>
+          <w:lang w:eastAsia="en-GB"/>
+        </w:rPr>
+        <w:t>Opcode Latch</w:t>
+      </w:r>
+    </w:p>
+    <w:p>
+      <w:pPr>
+        <w:rPr>
+          <w:lang w:eastAsia="en-GB"/>
+        </w:rPr>
+      </w:pPr>
+      <w:r>
+        <w:rPr>
+          <w:lang w:eastAsia="en-GB"/>
+        </w:rPr>
+        <w:t xml:space="preserve">The function of this block is to </w:t>
+      </w:r>
+      <w:r>
+        <w:rPr>
+          <w:lang w:eastAsia="en-GB"/>
+        </w:rPr>
+        <w:t>&lt;</w:t>
+      </w:r>
+      <w:proofErr w:type="spellStart"/>
+      <w:proofErr w:type="gramStart"/>
+      <w:r>
+        <w:rPr>
+          <w:lang w:eastAsia="en-GB"/>
+        </w:rPr>
+        <w:t>tbd</w:t>
+      </w:r>
+      <w:proofErr w:type="spellEnd"/>
+      <w:proofErr w:type="gramEnd"/>
+      <w:r>
+        <w:rPr>
+          <w:lang w:eastAsia="en-GB"/>
+        </w:rPr>
+        <w:t>&gt;</w:t>
+      </w:r>
+    </w:p>
+    <w:p>
+      <w:pPr>
+        <w:rPr>
+          <w:lang w:eastAsia="en-GB"/>
+        </w:rPr>
+      </w:pPr>
+      <w:r>
+        <w:rPr>
+          <w:lang w:eastAsia="en-GB"/>
+        </w:rPr>
+        <w:t>&lt;</w:t>
+      </w:r>
+      <w:proofErr w:type="spellStart"/>
+      <w:proofErr w:type="gramStart"/>
+      <w:r>
+        <w:rPr>
+          <w:lang w:eastAsia="en-GB"/>
+        </w:rPr>
+        <w:t>tbd</w:t>
+      </w:r>
+      <w:proofErr w:type="spellEnd"/>
+      <w:proofErr w:type="gramEnd"/>
+      <w:r>
+        <w:rPr>
+          <w:lang w:eastAsia="en-GB"/>
+        </w:rPr>
+        <w:t xml:space="preserve"> which is it&gt;</w:t>
+      </w:r>
+    </w:p>
+    <w:p>
+      <w:pPr>
+        <w:rPr>
+          <w:lang w:eastAsia="en-GB"/>
+        </w:rPr>
+      </w:pPr>
+      <w:bookmarkStart w:id="13" w:name="SufficientInfo"/>
+      <w:r>
+        <w:rPr>
+          <w:lang w:eastAsia="en-GB"/>
+        </w:rPr>
+        <w:t xml:space="preserve">This should be sufficient information for producing a schematic diagram for this part of the ALU without needing any further level 2 </w:t>
+      </w:r>
+      <w:proofErr w:type="gramStart"/>
+      <w:r>
+        <w:rPr>
+          <w:lang w:eastAsia="en-GB"/>
+        </w:rPr>
+        <w:t>design</w:t>
+      </w:r>
+      <w:bookmarkEnd w:id="13"/>
+      <w:proofErr w:type="gramEnd"/>
+      <w:r>
+        <w:rPr>
+          <w:lang w:eastAsia="en-GB"/>
+        </w:rPr>
+        <w:t>.</w:t>
+      </w:r>
+    </w:p>
+    <w:p>
+      <w:pPr>
+        <w:rPr>
+          <w:lang w:eastAsia="en-GB"/>
+        </w:rPr>
+      </w:pPr>
+      <w:bookmarkStart w:id="14" w:name="ComplexInfo"/>
+      <w:r>
+        <w:rPr>
+          <w:color w:val="FF0000"/>
+          <w:lang w:eastAsia="en-GB"/>
+        </w:rPr>
+        <w:t xml:space="preserve">This complex block will need a level 2 block diagram and further text to define the function of each block on that level 2 </w:t>
+      </w:r>
+      <w:proofErr w:type="gramStart"/>
+      <w:r>
+        <w:rPr>
+          <w:color w:val="FF0000"/>
+          <w:lang w:eastAsia="en-GB"/>
+        </w:rPr>
+        <w:t>diagram</w:t>
+      </w:r>
+      <w:bookmarkEnd w:id="14"/>
+      <w:proofErr w:type="gramEnd"/>
+      <w:r>
+        <w:rPr>
+          <w:lang w:eastAsia="en-GB"/>
+        </w:rPr>
+        <w:t>.</w:t>
+      </w:r>
     </w:p>
     <w:p>
       <w:pPr>
@@ -7653,21 +7606,35 @@
           <w:lang w:eastAsia="en-GB"/>
         </w:rPr>
       </w:pPr>
-      <w:r>
-        <w:rPr>
-          <w:lang w:eastAsia="en-GB"/>
-        </w:rPr>
-        <w:br w:type="page"/>
-      </w:r>
+      <w:bookmarkStart w:id="15" w:name="_Ref172648415"/>
     </w:p>
     <w:p>
       <w:pPr>
+        <w:rPr>
+          <w:rFonts w:asciiTheme="majorHAnsi" w:eastAsiaTheme="majorEastAsia" w:hAnsiTheme="majorHAnsi" w:cstheme="majorBidi"/>
+          <w:b/>
+          <w:bCs/>
+          <w:color w:val="365F91" w:themeColor="accent1" w:themeShade="BF"/>
+          <w:sz w:val="28"/>
+          <w:szCs w:val="28"/>
+          <w:lang w:eastAsia="en-GB"/>
+        </w:rPr>
+      </w:pPr>
+      <w:r>
+        <w:rPr>
+          <w:lang w:eastAsia="en-GB"/>
+        </w:rPr>
+        <w:br w:type="page"/>
+      </w:r>
+    </w:p>
+    <w:p>
+      <w:pPr>
         <w:pStyle w:val="Heading1"/>
         <w:rPr>
           <w:lang w:eastAsia="en-GB"/>
         </w:rPr>
       </w:pPr>
-      <w:bookmarkStart w:id="17" w:name="_Toc232842933"/>
+      <w:bookmarkStart w:id="16" w:name="_Toc232842933"/>
       <w:r>
         <w:rPr>
           <w:lang w:eastAsia="en-GB"/>
@@ -7675,10 +7642,10 @@
         <w:lastRenderedPageBreak/>
         <w:t>References</w:t>
       </w:r>
+      <w:bookmarkEnd w:id="15"/>
       <w:bookmarkEnd w:id="16"/>
-      <w:bookmarkEnd w:id="17"/>
     </w:p>
-    <w:bookmarkStart w:id="18" w:name="AVR_Instruction_Doc"/>
+    <w:bookmarkStart w:id="17" w:name="AVR_Instruction_Doc"/>
     <w:p>
       <w:pPr>
         <w:pStyle w:val="ListParagraph"/>
@@ -7715,7 +7682,7 @@
         </w:rPr>
         <w:t>AVR Instruction Set Manual</w:t>
       </w:r>
-      <w:bookmarkEnd w:id="18"/>
+      <w:bookmarkEnd w:id="17"/>
       <w:r>
         <w:rPr>
           <w:lang w:eastAsia="en-GB"/>
@@ -7723,7 +7690,7 @@
         <w:fldChar w:fldCharType="end"/>
       </w:r>
     </w:p>
-    <w:bookmarkStart w:id="19" w:name="RefCpuDesign"/>
+    <w:bookmarkStart w:id="18" w:name="RefCpuDesign"/>
     <w:p>
       <w:pPr>
         <w:pStyle w:val="ListParagraph"/>
@@ -7758,9 +7725,23 @@
           <w:rStyle w:val="Hyperlink"/>
           <w:lang w:eastAsia="en-GB"/>
         </w:rPr>
-        <w:t>CpuDesign.docx</w:t>
-      </w:r>
-      <w:bookmarkEnd w:id="19"/>
+        <w:t>CpuDesig</w:t>
+      </w:r>
+      <w:r>
+        <w:rPr>
+          <w:rStyle w:val="Hyperlink"/>
+          <w:lang w:eastAsia="en-GB"/>
+        </w:rPr>
+        <w:t>n</w:t>
+      </w:r>
+      <w:r>
+        <w:rPr>
+          <w:rStyle w:val="Hyperlink"/>
+          <w:lang w:eastAsia="en-GB"/>
+        </w:rPr>
+        <w:t>.docx</w:t>
+      </w:r>
+      <w:bookmarkEnd w:id="18"/>
       <w:r>
         <w:rPr>
           <w:lang w:eastAsia="en-GB"/>
@@ -7768,7 +7749,7 @@
         <w:fldChar w:fldCharType="end"/>
       </w:r>
     </w:p>
-    <w:bookmarkStart w:id="20" w:name="RefL1SeqXlsx"/>
+    <w:bookmarkStart w:id="19" w:name="RefL1SeqXlsx"/>
     <w:p>
       <w:pPr>
         <w:pStyle w:val="ListParagraph"/>
@@ -7803,21 +7784,7 @@
           <w:rStyle w:val="Hyperlink"/>
           <w:lang w:eastAsia="en-GB"/>
         </w:rPr>
-        <w:t>L1IsSeq</w:t>
-      </w:r>
-      <w:r>
-        <w:rPr>
-          <w:rStyle w:val="Hyperlink"/>
-          <w:lang w:eastAsia="en-GB"/>
-        </w:rPr>
-        <w:t>u</w:t>
-      </w:r>
-      <w:r>
-        <w:rPr>
-          <w:rStyle w:val="Hyperlink"/>
-          <w:lang w:eastAsia="en-GB"/>
-        </w:rPr>
-        <w:t>ences.xlsx</w:t>
+        <w:t>L1IsSequences.xlsx</w:t>
       </w:r>
       <w:r>
         <w:rPr>
@@ -7825,7 +7792,7 @@
         </w:rPr>
         <w:fldChar w:fldCharType="end"/>
       </w:r>
-      <w:bookmarkEnd w:id="20"/>
+      <w:bookmarkEnd w:id="19"/>
     </w:p>
     <w:p>
       <w:pPr>
@@ -7944,7 +7911,7 @@
               <w:b/>
               <w:noProof/>
             </w:rPr>
-            <w:t>2</w:t>
+            <w:t>4</w:t>
           </w:r>
         </w:fldSimple>
       </w:p>
@@ -8136,6 +8103,119 @@
     </w:lvl>
   </w:abstractNum>
   <w:abstractNum w:abstractNumId="1">
+    <w:nsid w:val="0D3A1471"/>
+    <w:multiLevelType w:val="hybridMultilevel"/>
+    <w:tmpl w:val="DBF49EA0"/>
+    <w:lvl w:ilvl="0" w:tplc="08090001">
+      <w:start w:val="1"/>
+      <w:numFmt w:val="bullet"/>
+      <w:lvlText w:val=""/>
+      <w:lvlJc w:val="left"/>
+      <w:pPr>
+        <w:ind w:left="720" w:hanging="360"/>
+      </w:pPr>
+      <w:rPr>
+        <w:rFonts w:ascii="Symbol" w:hAnsi="Symbol" w:hint="default"/>
+      </w:rPr>
+    </w:lvl>
+    <w:lvl w:ilvl="1" w:tplc="08090003">
+      <w:start w:val="1"/>
+      <w:numFmt w:val="bullet"/>
+      <w:lvlText w:val="o"/>
+      <w:lvlJc w:val="left"/>
+      <w:pPr>
+        <w:ind w:left="1440" w:hanging="360"/>
+      </w:pPr>
+      <w:rPr>
+        <w:rFonts w:ascii="Courier New" w:hAnsi="Courier New" w:cs="Courier New" w:hint="default"/>
+      </w:rPr>
+    </w:lvl>
+    <w:lvl w:ilvl="2" w:tplc="08090005">
+      <w:start w:val="1"/>
+      <w:numFmt w:val="bullet"/>
+      <w:lvlText w:val=""/>
+      <w:lvlJc w:val="left"/>
+      <w:pPr>
+        <w:ind w:left="2160" w:hanging="360"/>
+      </w:pPr>
+      <w:rPr>
+        <w:rFonts w:ascii="Wingdings" w:hAnsi="Wingdings" w:hint="default"/>
+      </w:rPr>
+    </w:lvl>
+    <w:lvl w:ilvl="3" w:tplc="08090001" w:tentative="1">
+      <w:start w:val="1"/>
+      <w:numFmt w:val="bullet"/>
+      <w:lvlText w:val=""/>
+      <w:lvlJc w:val="left"/>
+      <w:pPr>
+        <w:ind w:left="2880" w:hanging="360"/>
+      </w:pPr>
+      <w:rPr>
+        <w:rFonts w:ascii="Symbol" w:hAnsi="Symbol" w:hint="default"/>
+      </w:rPr>
+    </w:lvl>
+    <w:lvl w:ilvl="4" w:tplc="08090003" w:tentative="1">
+      <w:start w:val="1"/>
+      <w:numFmt w:val="bullet"/>
+      <w:lvlText w:val="o"/>
+      <w:lvlJc w:val="left"/>
+      <w:pPr>
+        <w:ind w:left="3600" w:hanging="360"/>
+      </w:pPr>
+      <w:rPr>
+        <w:rFonts w:ascii="Courier New" w:hAnsi="Courier New" w:cs="Courier New" w:hint="default"/>
+      </w:rPr>
+    </w:lvl>
+    <w:lvl w:ilvl="5" w:tplc="08090005" w:tentative="1">
+      <w:start w:val="1"/>
+      <w:numFmt w:val="bullet"/>
+      <w:lvlText w:val=""/>
+      <w:lvlJc w:val="left"/>
+      <w:pPr>
+        <w:ind w:left="4320" w:hanging="360"/>
+      </w:pPr>
+      <w:rPr>
+        <w:rFonts w:ascii="Wingdings" w:hAnsi="Wingdings" w:hint="default"/>
+      </w:rPr>
+    </w:lvl>
+    <w:lvl w:ilvl="6" w:tplc="08090001" w:tentative="1">
+      <w:start w:val="1"/>
+      <w:numFmt w:val="bullet"/>
+      <w:lvlText w:val=""/>
+      <w:lvlJc w:val="left"/>
+      <w:pPr>
+        <w:ind w:left="5040" w:hanging="360"/>
+      </w:pPr>
+      <w:rPr>
+        <w:rFonts w:ascii="Symbol" w:hAnsi="Symbol" w:hint="default"/>
+      </w:rPr>
+    </w:lvl>
+    <w:lvl w:ilvl="7" w:tplc="08090003" w:tentative="1">
+      <w:start w:val="1"/>
+      <w:numFmt w:val="bullet"/>
+      <w:lvlText w:val="o"/>
+      <w:lvlJc w:val="left"/>
+      <w:pPr>
+        <w:ind w:left="5760" w:hanging="360"/>
+      </w:pPr>
+      <w:rPr>
+        <w:rFonts w:ascii="Courier New" w:hAnsi="Courier New" w:cs="Courier New" w:hint="default"/>
+      </w:rPr>
+    </w:lvl>
+    <w:lvl w:ilvl="8" w:tplc="08090005" w:tentative="1">
+      <w:start w:val="1"/>
+      <w:numFmt w:val="bullet"/>
+      <w:lvlText w:val=""/>
+      <w:lvlJc w:val="left"/>
+      <w:pPr>
+        <w:ind w:left="6480" w:hanging="360"/>
+      </w:pPr>
+      <w:rPr>
+        <w:rFonts w:ascii="Wingdings" w:hAnsi="Wingdings" w:hint="default"/>
+      </w:rPr>
+    </w:lvl>
+  </w:abstractNum>
+  <w:abstractNum w:abstractNumId="2">
     <w:nsid w:val="0F961AA0"/>
     <w:multiLevelType w:val="hybridMultilevel"/>
     <w:tmpl w:val="6708FDB8"/>
@@ -8224,7 +8304,7 @@
       </w:pPr>
     </w:lvl>
   </w:abstractNum>
-  <w:abstractNum w:abstractNumId="2">
+  <w:abstractNum w:abstractNumId="3">
     <w:nsid w:val="14CA3A80"/>
     <w:multiLevelType w:val="hybridMultilevel"/>
     <w:tmpl w:val="0CB6F802"/>
@@ -8337,7 +8417,7 @@
       </w:rPr>
     </w:lvl>
   </w:abstractNum>
-  <w:abstractNum w:abstractNumId="3">
+  <w:abstractNum w:abstractNumId="4">
     <w:nsid w:val="1DBB41D4"/>
     <w:multiLevelType w:val="hybridMultilevel"/>
     <w:tmpl w:val="6E2ABC92"/>
@@ -8423,7 +8503,7 @@
       </w:pPr>
     </w:lvl>
   </w:abstractNum>
-  <w:abstractNum w:abstractNumId="4">
+  <w:abstractNum w:abstractNumId="5">
     <w:nsid w:val="20C4464B"/>
     <w:multiLevelType w:val="hybridMultilevel"/>
     <w:tmpl w:val="FF9EE358"/>
@@ -8536,7 +8616,7 @@
       </w:rPr>
     </w:lvl>
   </w:abstractNum>
-  <w:abstractNum w:abstractNumId="5">
+  <w:abstractNum w:abstractNumId="6">
     <w:nsid w:val="28A46859"/>
     <w:multiLevelType w:val="hybridMultilevel"/>
     <w:tmpl w:val="EC4EF1DC"/>
@@ -8649,7 +8729,7 @@
       </w:rPr>
     </w:lvl>
   </w:abstractNum>
-  <w:abstractNum w:abstractNumId="6">
+  <w:abstractNum w:abstractNumId="7">
     <w:nsid w:val="2B174FDA"/>
     <w:multiLevelType w:val="hybridMultilevel"/>
     <w:tmpl w:val="37CAC300"/>
@@ -8762,7 +8842,7 @@
       </w:rPr>
     </w:lvl>
   </w:abstractNum>
-  <w:abstractNum w:abstractNumId="7">
+  <w:abstractNum w:abstractNumId="8">
     <w:nsid w:val="30D92F56"/>
     <w:multiLevelType w:val="hybridMultilevel"/>
     <w:tmpl w:val="F1445E58"/>
@@ -8848,7 +8928,7 @@
       </w:pPr>
     </w:lvl>
   </w:abstractNum>
-  <w:abstractNum w:abstractNumId="8">
+  <w:abstractNum w:abstractNumId="9">
     <w:nsid w:val="36E52853"/>
     <w:multiLevelType w:val="hybridMultilevel"/>
     <w:tmpl w:val="590A3C98"/>
@@ -8961,7 +9041,7 @@
       </w:rPr>
     </w:lvl>
   </w:abstractNum>
-  <w:abstractNum w:abstractNumId="9">
+  <w:abstractNum w:abstractNumId="10">
     <w:nsid w:val="38A37EA3"/>
     <w:multiLevelType w:val="hybridMultilevel"/>
     <w:tmpl w:val="0B88BD08"/>
@@ -9047,7 +9127,7 @@
       </w:pPr>
     </w:lvl>
   </w:abstractNum>
-  <w:abstractNum w:abstractNumId="10">
+  <w:abstractNum w:abstractNumId="11">
     <w:nsid w:val="3DA11B31"/>
     <w:multiLevelType w:val="hybridMultilevel"/>
     <w:tmpl w:val="C81448AA"/>
@@ -9160,7 +9240,7 @@
       </w:rPr>
     </w:lvl>
   </w:abstractNum>
-  <w:abstractNum w:abstractNumId="11">
+  <w:abstractNum w:abstractNumId="12">
     <w:nsid w:val="3F1E2626"/>
     <w:multiLevelType w:val="multilevel"/>
     <w:tmpl w:val="08090025"/>
@@ -9255,7 +9335,7 @@
       </w:pPr>
     </w:lvl>
   </w:abstractNum>
-  <w:abstractNum w:abstractNumId="12">
+  <w:abstractNum w:abstractNumId="13">
     <w:nsid w:val="3F270B44"/>
     <w:multiLevelType w:val="hybridMultilevel"/>
     <w:tmpl w:val="B8C25E36"/>
@@ -9368,7 +9448,93 @@
       </w:rPr>
     </w:lvl>
   </w:abstractNum>
-  <w:abstractNum w:abstractNumId="13">
+  <w:abstractNum w:abstractNumId="14">
+    <w:nsid w:val="46DF192C"/>
+    <w:multiLevelType w:val="hybridMultilevel"/>
+    <w:tmpl w:val="C67C00BE"/>
+    <w:lvl w:ilvl="0" w:tplc="0809000F">
+      <w:start w:val="1"/>
+      <w:numFmt w:val="decimal"/>
+      <w:lvlText w:val="%1."/>
+      <w:lvlJc w:val="left"/>
+      <w:pPr>
+        <w:ind w:left="720" w:hanging="360"/>
+      </w:pPr>
+    </w:lvl>
+    <w:lvl w:ilvl="1" w:tplc="08090019" w:tentative="1">
+      <w:start w:val="1"/>
+      <w:numFmt w:val="lowerLetter"/>
+      <w:lvlText w:val="%2."/>
+      <w:lvlJc w:val="left"/>
+      <w:pPr>
+        <w:ind w:left="1440" w:hanging="360"/>
+      </w:pPr>
+    </w:lvl>
+    <w:lvl w:ilvl="2" w:tplc="0809001B" w:tentative="1">
+      <w:start w:val="1"/>
+      <w:numFmt w:val="lowerRoman"/>
+      <w:lvlText w:val="%3."/>
+      <w:lvlJc w:val="right"/>
+      <w:pPr>
+        <w:ind w:left="2160" w:hanging="180"/>
+      </w:pPr>
+    </w:lvl>
+    <w:lvl w:ilvl="3" w:tplc="0809000F" w:tentative="1">
+      <w:start w:val="1"/>
+      <w:numFmt w:val="decimal"/>
+      <w:lvlText w:val="%4."/>
+      <w:lvlJc w:val="left"/>
+      <w:pPr>
+        <w:ind w:left="2880" w:hanging="360"/>
+      </w:pPr>
+    </w:lvl>
+    <w:lvl w:ilvl="4" w:tplc="08090019" w:tentative="1">
+      <w:start w:val="1"/>
+      <w:numFmt w:val="lowerLetter"/>
+      <w:lvlText w:val="%5."/>
+      <w:lvlJc w:val="left"/>
+      <w:pPr>
+        <w:ind w:left="3600" w:hanging="360"/>
+      </w:pPr>
+    </w:lvl>
+    <w:lvl w:ilvl="5" w:tplc="0809001B" w:tentative="1">
+      <w:start w:val="1"/>
+      <w:numFmt w:val="lowerRoman"/>
+      <w:lvlText w:val="%6."/>
+      <w:lvlJc w:val="right"/>
+      <w:pPr>
+        <w:ind w:left="4320" w:hanging="180"/>
+      </w:pPr>
+    </w:lvl>
+    <w:lvl w:ilvl="6" w:tplc="0809000F" w:tentative="1">
+      <w:start w:val="1"/>
+      <w:numFmt w:val="decimal"/>
+      <w:lvlText w:val="%7."/>
+      <w:lvlJc w:val="left"/>
+      <w:pPr>
+        <w:ind w:left="5040" w:hanging="360"/>
+      </w:pPr>
+    </w:lvl>
+    <w:lvl w:ilvl="7" w:tplc="08090019" w:tentative="1">
+      <w:start w:val="1"/>
+      <w:numFmt w:val="lowerLetter"/>
+      <w:lvlText w:val="%8."/>
+      <w:lvlJc w:val="left"/>
+      <w:pPr>
+        <w:ind w:left="5760" w:hanging="360"/>
+      </w:pPr>
+    </w:lvl>
+    <w:lvl w:ilvl="8" w:tplc="0809001B" w:tentative="1">
+      <w:start w:val="1"/>
+      <w:numFmt w:val="lowerRoman"/>
+      <w:lvlText w:val="%9."/>
+      <w:lvlJc w:val="right"/>
+      <w:pPr>
+        <w:ind w:left="6480" w:hanging="180"/>
+      </w:pPr>
+    </w:lvl>
+  </w:abstractNum>
+  <w:abstractNum w:abstractNumId="15">
     <w:nsid w:val="49B43EC9"/>
     <w:multiLevelType w:val="hybridMultilevel"/>
     <w:tmpl w:val="C04CC570"/>
@@ -9481,7 +9647,7 @@
       </w:rPr>
     </w:lvl>
   </w:abstractNum>
-  <w:abstractNum w:abstractNumId="14">
+  <w:abstractNum w:abstractNumId="16">
     <w:nsid w:val="52292902"/>
     <w:multiLevelType w:val="hybridMultilevel"/>
     <w:tmpl w:val="C7660ABC"/>
@@ -9594,7 +9760,7 @@
       </w:rPr>
     </w:lvl>
   </w:abstractNum>
-  <w:abstractNum w:abstractNumId="15">
+  <w:abstractNum w:abstractNumId="17">
     <w:nsid w:val="54CA172C"/>
     <w:multiLevelType w:val="hybridMultilevel"/>
     <w:tmpl w:val="0B88BD08"/>
@@ -9680,7 +9846,7 @@
       </w:pPr>
     </w:lvl>
   </w:abstractNum>
-  <w:abstractNum w:abstractNumId="16">
+  <w:abstractNum w:abstractNumId="18">
     <w:nsid w:val="5BC26D00"/>
     <w:multiLevelType w:val="hybridMultilevel"/>
     <w:tmpl w:val="CBB6913A"/>
@@ -9793,7 +9959,7 @@
       </w:rPr>
     </w:lvl>
   </w:abstractNum>
-  <w:abstractNum w:abstractNumId="17">
+  <w:abstractNum w:abstractNumId="19">
     <w:nsid w:val="5CAB6725"/>
     <w:multiLevelType w:val="hybridMultilevel"/>
     <w:tmpl w:val="7F22D460"/>
@@ -9906,7 +10072,7 @@
       </w:rPr>
     </w:lvl>
   </w:abstractNum>
-  <w:abstractNum w:abstractNumId="18">
+  <w:abstractNum w:abstractNumId="20">
     <w:nsid w:val="5F103C21"/>
     <w:multiLevelType w:val="hybridMultilevel"/>
     <w:tmpl w:val="DBC01600"/>
@@ -9995,7 +10161,7 @@
       </w:pPr>
     </w:lvl>
   </w:abstractNum>
-  <w:abstractNum w:abstractNumId="19">
+  <w:abstractNum w:abstractNumId="21">
     <w:nsid w:val="67C95051"/>
     <w:multiLevelType w:val="hybridMultilevel"/>
     <w:tmpl w:val="1804C8C8"/>
@@ -10108,7 +10274,7 @@
       </w:rPr>
     </w:lvl>
   </w:abstractNum>
-  <w:abstractNum w:abstractNumId="20">
+  <w:abstractNum w:abstractNumId="22">
     <w:nsid w:val="6BF155FE"/>
     <w:multiLevelType w:val="hybridMultilevel"/>
     <w:tmpl w:val="9796EE38"/>
@@ -10194,7 +10360,7 @@
       </w:pPr>
     </w:lvl>
   </w:abstractNum>
-  <w:abstractNum w:abstractNumId="21">
+  <w:abstractNum w:abstractNumId="23">
     <w:nsid w:val="72C52DE3"/>
     <w:multiLevelType w:val="hybridMultilevel"/>
     <w:tmpl w:val="29109174"/>
@@ -10307,7 +10473,7 @@
       </w:rPr>
     </w:lvl>
   </w:abstractNum>
-  <w:abstractNum w:abstractNumId="22">
+  <w:abstractNum w:abstractNumId="24">
     <w:nsid w:val="77B47D33"/>
     <w:multiLevelType w:val="hybridMultilevel"/>
     <w:tmpl w:val="AA146E8C"/>
@@ -10420,7 +10586,7 @@
       </w:rPr>
     </w:lvl>
   </w:abstractNum>
-  <w:abstractNum w:abstractNumId="23">
+  <w:abstractNum w:abstractNumId="25">
     <w:nsid w:val="7DAB54F1"/>
     <w:multiLevelType w:val="hybridMultilevel"/>
     <w:tmpl w:val="B7A2471E"/>
@@ -10533,7 +10699,7 @@
       </w:rPr>
     </w:lvl>
   </w:abstractNum>
-  <w:abstractNum w:abstractNumId="24">
+  <w:abstractNum w:abstractNumId="26">
     <w:nsid w:val="7F6475FB"/>
     <w:multiLevelType w:val="hybridMultilevel"/>
     <w:tmpl w:val="CD608B4E"/>
@@ -10647,79 +10813,85 @@
     </w:lvl>
   </w:abstractNum>
   <w:num w:numId="1">
+    <w:abstractNumId w:val="12"/>
+  </w:num>
+  <w:num w:numId="2">
+    <w:abstractNumId w:val="4"/>
+  </w:num>
+  <w:num w:numId="3">
+    <w:abstractNumId w:val="6"/>
+  </w:num>
+  <w:num w:numId="4">
+    <w:abstractNumId w:val="20"/>
+  </w:num>
+  <w:num w:numId="5">
+    <w:abstractNumId w:val="23"/>
+  </w:num>
+  <w:num w:numId="6">
+    <w:abstractNumId w:val="15"/>
+  </w:num>
+  <w:num w:numId="7">
+    <w:abstractNumId w:val="5"/>
+  </w:num>
+  <w:num w:numId="8">
+    <w:abstractNumId w:val="7"/>
+  </w:num>
+  <w:num w:numId="9">
+    <w:abstractNumId w:val="26"/>
+  </w:num>
+  <w:num w:numId="10">
+    <w:abstractNumId w:val="24"/>
+  </w:num>
+  <w:num w:numId="11">
+    <w:abstractNumId w:val="25"/>
+  </w:num>
+  <w:num w:numId="12">
+    <w:abstractNumId w:val="21"/>
+  </w:num>
+  <w:num w:numId="13">
+    <w:abstractNumId w:val="10"/>
+  </w:num>
+  <w:num w:numId="14">
     <w:abstractNumId w:val="11"/>
   </w:num>
-  <w:num w:numId="2">
-    <w:abstractNumId w:val="3"/>
-  </w:num>
-  <w:num w:numId="3">
-    <w:abstractNumId w:val="5"/>
-  </w:num>
-  <w:num w:numId="4">
-    <w:abstractNumId w:val="18"/>
-  </w:num>
-  <w:num w:numId="5">
-    <w:abstractNumId w:val="21"/>
-  </w:num>
-  <w:num w:numId="6">
-    <w:abstractNumId w:val="13"/>
-  </w:num>
-  <w:num w:numId="7">
-    <w:abstractNumId w:val="4"/>
-  </w:num>
-  <w:num w:numId="8">
-    <w:abstractNumId w:val="6"/>
-  </w:num>
-  <w:num w:numId="9">
-    <w:abstractNumId w:val="24"/>
-  </w:num>
-  <w:num w:numId="10">
-    <w:abstractNumId w:val="22"/>
-  </w:num>
-  <w:num w:numId="11">
-    <w:abstractNumId w:val="23"/>
-  </w:num>
-  <w:num w:numId="12">
+  <w:num w:numId="15">
     <w:abstractNumId w:val="19"/>
   </w:num>
-  <w:num w:numId="13">
-    <w:abstractNumId w:val="9"/>
+  <w:num w:numId="16">
+    <w:abstractNumId w:val="8"/>
   </w:num>
-  <w:num w:numId="14">
-    <w:abstractNumId w:val="10"/>
-  </w:num>
-  <w:num w:numId="15">
+  <w:num w:numId="17">
     <w:abstractNumId w:val="17"/>
   </w:num>
-  <w:num w:numId="16">
-    <w:abstractNumId w:val="7"/>
-  </w:num>
-  <w:num w:numId="17">
-    <w:abstractNumId w:val="15"/>
-  </w:num>
   <w:num w:numId="18">
-    <w:abstractNumId w:val="1"/>
+    <w:abstractNumId w:val="2"/>
   </w:num>
   <w:num w:numId="19">
-    <w:abstractNumId w:val="14"/>
+    <w:abstractNumId w:val="16"/>
   </w:num>
   <w:num w:numId="20">
     <w:abstractNumId w:val="0"/>
   </w:num>
   <w:num w:numId="21">
-    <w:abstractNumId w:val="12"/>
+    <w:abstractNumId w:val="13"/>
   </w:num>
   <w:num w:numId="22">
-    <w:abstractNumId w:val="8"/>
+    <w:abstractNumId w:val="9"/>
   </w:num>
   <w:num w:numId="23">
-    <w:abstractNumId w:val="2"/>
+    <w:abstractNumId w:val="3"/>
   </w:num>
   <w:num w:numId="24">
-    <w:abstractNumId w:val="16"/>
+    <w:abstractNumId w:val="18"/>
   </w:num>
   <w:num w:numId="25">
-    <w:abstractNumId w:val="20"/>
+    <w:abstractNumId w:val="22"/>
+  </w:num>
+  <w:num w:numId="26">
+    <w:abstractNumId w:val="14"/>
+  </w:num>
+  <w:num w:numId="27">
+    <w:abstractNumId w:val="1"/>
   </w:num>
   <w:numIdMacAtCleanup w:val="18"/>
 </w:numbering>
@@ -11857,7 +12029,7 @@
 </file>
 
 <file path=customXml/itemProps2.xml><?xml version="1.0" encoding="utf-8"?>
-<ds:datastoreItem xmlns:ds="http://schemas.openxmlformats.org/officeDocument/2006/customXml" ds:itemID="{68C812D9-935D-4D8A-AD80-9711DF370725}">
+<ds:datastoreItem xmlns:ds="http://schemas.openxmlformats.org/officeDocument/2006/customXml" ds:itemID="{992BA01A-F1B6-4301-AAC0-1C5762559C13}">
   <ds:schemaRefs>
     <ds:schemaRef ds:uri="http://schemas.openxmlformats.org/officeDocument/2006/bibliography"/>
   </ds:schemaRefs>

</xml_diff>

<commit_message>
L2 work in progress
</commit_message>
<xml_diff>
--- a/CPU Design/L1IsDesign.docx
+++ b/CPU Design/L1IsDesign.docx
@@ -487,7 +487,7 @@
           <w:r>
             <w:fldChar w:fldCharType="separate"/>
           </w:r>
-          <w:hyperlink w:anchor="_Toc233543215" w:history="1">
+          <w:hyperlink w:anchor="_Toc233637722" w:history="1">
             <w:r>
               <w:rPr>
                 <w:rStyle w:val="Hyperlink"/>
@@ -533,7 +533,7 @@
                 <w:noProof/>
                 <w:webHidden/>
               </w:rPr>
-              <w:instrText xml:space="preserve"> PAGEREF _Toc233543215 \h </w:instrText>
+              <w:instrText xml:space="preserve"> PAGEREF _Toc233637722 \h </w:instrText>
             </w:r>
             <w:r>
               <w:rPr>
@@ -577,7 +577,7 @@
               <w:lang w:eastAsia="en-GB"/>
             </w:rPr>
           </w:pPr>
-          <w:hyperlink w:anchor="_Toc233543216" w:history="1">
+          <w:hyperlink w:anchor="_Toc233637723" w:history="1">
             <w:r>
               <w:rPr>
                 <w:rStyle w:val="Hyperlink"/>
@@ -621,7 +621,7 @@
                 <w:noProof/>
                 <w:webHidden/>
               </w:rPr>
-              <w:instrText xml:space="preserve"> PAGEREF _Toc233543216 \h </w:instrText>
+              <w:instrText xml:space="preserve"> PAGEREF _Toc233637723 \h </w:instrText>
             </w:r>
             <w:r>
               <w:rPr>
@@ -665,7 +665,7 @@
               <w:lang w:eastAsia="en-GB"/>
             </w:rPr>
           </w:pPr>
-          <w:hyperlink w:anchor="_Toc233543217" w:history="1">
+          <w:hyperlink w:anchor="_Toc233637724" w:history="1">
             <w:r>
               <w:rPr>
                 <w:rStyle w:val="Hyperlink"/>
@@ -709,7 +709,7 @@
                 <w:noProof/>
                 <w:webHidden/>
               </w:rPr>
-              <w:instrText xml:space="preserve"> PAGEREF _Toc233543217 \h </w:instrText>
+              <w:instrText xml:space="preserve"> PAGEREF _Toc233637724 \h </w:instrText>
             </w:r>
             <w:r>
               <w:rPr>
@@ -753,7 +753,7 @@
               <w:lang w:eastAsia="en-GB"/>
             </w:rPr>
           </w:pPr>
-          <w:hyperlink w:anchor="_Toc233543218" w:history="1">
+          <w:hyperlink w:anchor="_Toc233637725" w:history="1">
             <w:r>
               <w:rPr>
                 <w:rStyle w:val="Hyperlink"/>
@@ -797,7 +797,7 @@
                 <w:noProof/>
                 <w:webHidden/>
               </w:rPr>
-              <w:instrText xml:space="preserve"> PAGEREF _Toc233543218 \h </w:instrText>
+              <w:instrText xml:space="preserve"> PAGEREF _Toc233637725 \h </w:instrText>
             </w:r>
             <w:r>
               <w:rPr>
@@ -841,7 +841,7 @@
               <w:lang w:eastAsia="en-GB"/>
             </w:rPr>
           </w:pPr>
-          <w:hyperlink w:anchor="_Toc233543219" w:history="1">
+          <w:hyperlink w:anchor="_Toc233637726" w:history="1">
             <w:r>
               <w:rPr>
                 <w:rStyle w:val="Hyperlink"/>
@@ -885,7 +885,7 @@
                 <w:noProof/>
                 <w:webHidden/>
               </w:rPr>
-              <w:instrText xml:space="preserve"> PAGEREF _Toc233543219 \h </w:instrText>
+              <w:instrText xml:space="preserve"> PAGEREF _Toc233637726 \h </w:instrText>
             </w:r>
             <w:r>
               <w:rPr>
@@ -929,7 +929,7 @@
               <w:lang w:eastAsia="en-GB"/>
             </w:rPr>
           </w:pPr>
-          <w:hyperlink w:anchor="_Toc233543220" w:history="1">
+          <w:hyperlink w:anchor="_Toc233637727" w:history="1">
             <w:r>
               <w:rPr>
                 <w:rStyle w:val="Hyperlink"/>
@@ -973,7 +973,7 @@
                 <w:noProof/>
                 <w:webHidden/>
               </w:rPr>
-              <w:instrText xml:space="preserve"> PAGEREF _Toc233543220 \h </w:instrText>
+              <w:instrText xml:space="preserve"> PAGEREF _Toc233637727 \h </w:instrText>
             </w:r>
             <w:r>
               <w:rPr>
@@ -1017,7 +1017,7 @@
               <w:lang w:eastAsia="en-GB"/>
             </w:rPr>
           </w:pPr>
-          <w:hyperlink w:anchor="_Toc233543221" w:history="1">
+          <w:hyperlink w:anchor="_Toc233637728" w:history="1">
             <w:r>
               <w:rPr>
                 <w:rStyle w:val="Hyperlink"/>
@@ -1068,7 +1068,7 @@
                 <w:noProof/>
                 <w:webHidden/>
               </w:rPr>
-              <w:instrText xml:space="preserve"> PAGEREF _Toc233543221 \h </w:instrText>
+              <w:instrText xml:space="preserve"> PAGEREF _Toc233637728 \h </w:instrText>
             </w:r>
             <w:r>
               <w:rPr>
@@ -1112,7 +1112,7 @@
               <w:lang w:eastAsia="en-GB"/>
             </w:rPr>
           </w:pPr>
-          <w:hyperlink w:anchor="_Toc233543222" w:history="1">
+          <w:hyperlink w:anchor="_Toc233637729" w:history="1">
             <w:r>
               <w:rPr>
                 <w:rStyle w:val="Hyperlink"/>
@@ -1156,7 +1156,7 @@
                 <w:noProof/>
                 <w:webHidden/>
               </w:rPr>
-              <w:instrText xml:space="preserve"> PAGEREF _Toc233543222 \h </w:instrText>
+              <w:instrText xml:space="preserve"> PAGEREF _Toc233637729 \h </w:instrText>
             </w:r>
             <w:r>
               <w:rPr>
@@ -1200,7 +1200,7 @@
               <w:lang w:eastAsia="en-GB"/>
             </w:rPr>
           </w:pPr>
-          <w:hyperlink w:anchor="_Toc233543223" w:history="1">
+          <w:hyperlink w:anchor="_Toc233637730" w:history="1">
             <w:r>
               <w:rPr>
                 <w:rStyle w:val="Hyperlink"/>
@@ -1244,7 +1244,7 @@
                 <w:noProof/>
                 <w:webHidden/>
               </w:rPr>
-              <w:instrText xml:space="preserve"> PAGEREF _Toc233543223 \h </w:instrText>
+              <w:instrText xml:space="preserve"> PAGEREF _Toc233637730 \h </w:instrText>
             </w:r>
             <w:r>
               <w:rPr>
@@ -1288,7 +1288,7 @@
               <w:lang w:eastAsia="en-GB"/>
             </w:rPr>
           </w:pPr>
-          <w:hyperlink w:anchor="_Toc233543224" w:history="1">
+          <w:hyperlink w:anchor="_Toc233637731" w:history="1">
             <w:r>
               <w:rPr>
                 <w:rStyle w:val="Hyperlink"/>
@@ -1332,7 +1332,7 @@
                 <w:noProof/>
                 <w:webHidden/>
               </w:rPr>
-              <w:instrText xml:space="preserve"> PAGEREF _Toc233543224 \h </w:instrText>
+              <w:instrText xml:space="preserve"> PAGEREF _Toc233637731 \h </w:instrText>
             </w:r>
             <w:r>
               <w:rPr>
@@ -1376,7 +1376,7 @@
               <w:lang w:eastAsia="en-GB"/>
             </w:rPr>
           </w:pPr>
-          <w:hyperlink w:anchor="_Toc233543225" w:history="1">
+          <w:hyperlink w:anchor="_Toc233637732" w:history="1">
             <w:r>
               <w:rPr>
                 <w:rStyle w:val="Hyperlink"/>
@@ -1420,7 +1420,7 @@
                 <w:noProof/>
                 <w:webHidden/>
               </w:rPr>
-              <w:instrText xml:space="preserve"> PAGEREF _Toc233543225 \h </w:instrText>
+              <w:instrText xml:space="preserve"> PAGEREF _Toc233637732 \h </w:instrText>
             </w:r>
             <w:r>
               <w:rPr>
@@ -1464,7 +1464,7 @@
               <w:lang w:eastAsia="en-GB"/>
             </w:rPr>
           </w:pPr>
-          <w:hyperlink w:anchor="_Toc233543226" w:history="1">
+          <w:hyperlink w:anchor="_Toc233637733" w:history="1">
             <w:r>
               <w:rPr>
                 <w:rStyle w:val="Hyperlink"/>
@@ -1508,7 +1508,7 @@
                 <w:noProof/>
                 <w:webHidden/>
               </w:rPr>
-              <w:instrText xml:space="preserve"> PAGEREF _Toc233543226 \h </w:instrText>
+              <w:instrText xml:space="preserve"> PAGEREF _Toc233637733 \h </w:instrText>
             </w:r>
             <w:r>
               <w:rPr>
@@ -1552,7 +1552,7 @@
               <w:lang w:eastAsia="en-GB"/>
             </w:rPr>
           </w:pPr>
-          <w:hyperlink w:anchor="_Toc233543227" w:history="1">
+          <w:hyperlink w:anchor="_Toc233637734" w:history="1">
             <w:r>
               <w:rPr>
                 <w:rStyle w:val="Hyperlink"/>
@@ -1596,7 +1596,7 @@
                 <w:noProof/>
                 <w:webHidden/>
               </w:rPr>
-              <w:instrText xml:space="preserve"> PAGEREF _Toc233543227 \h </w:instrText>
+              <w:instrText xml:space="preserve"> PAGEREF _Toc233637734 \h </w:instrText>
             </w:r>
             <w:r>
               <w:rPr>
@@ -1640,7 +1640,7 @@
               <w:lang w:eastAsia="en-GB"/>
             </w:rPr>
           </w:pPr>
-          <w:hyperlink w:anchor="_Toc233543228" w:history="1">
+          <w:hyperlink w:anchor="_Toc233637735" w:history="1">
             <w:r>
               <w:rPr>
                 <w:rStyle w:val="Hyperlink"/>
@@ -1684,7 +1684,7 @@
                 <w:noProof/>
                 <w:webHidden/>
               </w:rPr>
-              <w:instrText xml:space="preserve"> PAGEREF _Toc233543228 \h </w:instrText>
+              <w:instrText xml:space="preserve"> PAGEREF _Toc233637735 \h </w:instrText>
             </w:r>
             <w:r>
               <w:rPr>
@@ -1728,7 +1728,7 @@
               <w:lang w:eastAsia="en-GB"/>
             </w:rPr>
           </w:pPr>
-          <w:hyperlink w:anchor="_Toc233543229" w:history="1">
+          <w:hyperlink w:anchor="_Toc233637736" w:history="1">
             <w:r>
               <w:rPr>
                 <w:rStyle w:val="Hyperlink"/>
@@ -1772,7 +1772,7 @@
                 <w:noProof/>
                 <w:webHidden/>
               </w:rPr>
-              <w:instrText xml:space="preserve"> PAGEREF _Toc233543229 \h </w:instrText>
+              <w:instrText xml:space="preserve"> PAGEREF _Toc233637736 \h </w:instrText>
             </w:r>
             <w:r>
               <w:rPr>
@@ -1816,7 +1816,7 @@
               <w:lang w:eastAsia="en-GB"/>
             </w:rPr>
           </w:pPr>
-          <w:hyperlink w:anchor="_Toc233543230" w:history="1">
+          <w:hyperlink w:anchor="_Toc233637737" w:history="1">
             <w:r>
               <w:rPr>
                 <w:rStyle w:val="Hyperlink"/>
@@ -1860,7 +1860,7 @@
                 <w:noProof/>
                 <w:webHidden/>
               </w:rPr>
-              <w:instrText xml:space="preserve"> PAGEREF _Toc233543230 \h </w:instrText>
+              <w:instrText xml:space="preserve"> PAGEREF _Toc233637737 \h </w:instrText>
             </w:r>
             <w:r>
               <w:rPr>
@@ -1904,7 +1904,7 @@
               <w:lang w:eastAsia="en-GB"/>
             </w:rPr>
           </w:pPr>
-          <w:hyperlink w:anchor="_Toc233543231" w:history="1">
+          <w:hyperlink w:anchor="_Toc233637738" w:history="1">
             <w:r>
               <w:rPr>
                 <w:rStyle w:val="Hyperlink"/>
@@ -1927,6 +1927,94 @@
                 <w:noProof/>
                 <w:lang w:eastAsia="en-GB"/>
               </w:rPr>
+              <w:t>L2 Design For Sequence Control</w:t>
+            </w:r>
+            <w:r>
+              <w:rPr>
+                <w:noProof/>
+                <w:webHidden/>
+              </w:rPr>
+              <w:tab/>
+            </w:r>
+            <w:r>
+              <w:rPr>
+                <w:noProof/>
+                <w:webHidden/>
+              </w:rPr>
+              <w:fldChar w:fldCharType="begin"/>
+            </w:r>
+            <w:r>
+              <w:rPr>
+                <w:noProof/>
+                <w:webHidden/>
+              </w:rPr>
+              <w:instrText xml:space="preserve"> PAGEREF _Toc233637738 \h </w:instrText>
+            </w:r>
+            <w:r>
+              <w:rPr>
+                <w:noProof/>
+                <w:webHidden/>
+              </w:rPr>
+            </w:r>
+            <w:r>
+              <w:rPr>
+                <w:noProof/>
+                <w:webHidden/>
+              </w:rPr>
+              <w:fldChar w:fldCharType="separate"/>
+            </w:r>
+            <w:r>
+              <w:rPr>
+                <w:noProof/>
+                <w:webHidden/>
+              </w:rPr>
+              <w:t>10</w:t>
+            </w:r>
+            <w:r>
+              <w:rPr>
+                <w:noProof/>
+                <w:webHidden/>
+              </w:rPr>
+              <w:fldChar w:fldCharType="end"/>
+            </w:r>
+          </w:hyperlink>
+        </w:p>
+        <w:p>
+          <w:pPr>
+            <w:pStyle w:val="TOC1"/>
+            <w:tabs>
+              <w:tab w:val="left" w:pos="440"/>
+              <w:tab w:val="right" w:leader="dot" w:pos="9016"/>
+            </w:tabs>
+            <w:rPr>
+              <w:rFonts w:eastAsiaTheme="minorEastAsia"/>
+              <w:noProof/>
+              <w:lang w:eastAsia="en-GB"/>
+            </w:rPr>
+          </w:pPr>
+          <w:hyperlink w:anchor="_Toc233637739" w:history="1">
+            <w:r>
+              <w:rPr>
+                <w:rStyle w:val="Hyperlink"/>
+                <w:noProof/>
+                <w:lang w:eastAsia="en-GB"/>
+              </w:rPr>
+              <w:t>5</w:t>
+            </w:r>
+            <w:r>
+              <w:rPr>
+                <w:rFonts w:eastAsiaTheme="minorEastAsia"/>
+                <w:noProof/>
+                <w:lang w:eastAsia="en-GB"/>
+              </w:rPr>
+              <w:tab/>
+            </w:r>
+            <w:r>
+              <w:rPr>
+                <w:rStyle w:val="Hyperlink"/>
+                <w:noProof/>
+                <w:lang w:eastAsia="en-GB"/>
+              </w:rPr>
               <w:t>References</w:t>
             </w:r>
             <w:r>
@@ -1948,7 +2036,7 @@
                 <w:noProof/>
                 <w:webHidden/>
               </w:rPr>
-              <w:instrText xml:space="preserve"> PAGEREF _Toc233543231 \h </w:instrText>
+              <w:instrText xml:space="preserve"> PAGEREF _Toc233637739 \h </w:instrText>
             </w:r>
             <w:r>
               <w:rPr>
@@ -2443,7 +2531,7 @@
           <w:lang w:eastAsia="en-GB"/>
         </w:rPr>
       </w:pPr>
-      <w:bookmarkStart w:id="1" w:name="_Toc233543215"/>
+      <w:bookmarkStart w:id="1" w:name="_Toc233637722"/>
       <w:bookmarkEnd w:id="0"/>
       <w:r>
         <w:rPr>
@@ -2524,7 +2612,7 @@
           <w:lang w:eastAsia="en-GB"/>
         </w:rPr>
       </w:pPr>
-      <w:bookmarkStart w:id="2" w:name="_Toc233543216"/>
+      <w:bookmarkStart w:id="2" w:name="_Toc233637723"/>
       <w:r>
         <w:rPr>
           <w:lang w:eastAsia="en-GB"/>
@@ -3109,7 +3197,7 @@
           <w:lang w:eastAsia="en-GB"/>
         </w:rPr>
       </w:pPr>
-      <w:bookmarkStart w:id="5" w:name="_Toc233543217"/>
+      <w:bookmarkStart w:id="5" w:name="_Toc233637724"/>
       <w:r>
         <w:rPr>
           <w:lang w:eastAsia="en-GB"/>
@@ -4780,7 +4868,7 @@
           <w:lang w:eastAsia="en-GB"/>
         </w:rPr>
       </w:pPr>
-      <w:bookmarkStart w:id="7" w:name="_Toc233543218"/>
+      <w:bookmarkStart w:id="7" w:name="_Toc233637725"/>
       <w:r>
         <w:rPr>
           <w:lang w:eastAsia="en-GB"/>
@@ -4851,7 +4939,7 @@
           <w:lang w:eastAsia="en-GB"/>
         </w:rPr>
       </w:pPr>
-      <w:bookmarkStart w:id="8" w:name="_Toc233543219"/>
+      <w:bookmarkStart w:id="8" w:name="_Toc233637726"/>
       <w:r>
         <w:rPr>
           <w:rFonts w:eastAsiaTheme="minorHAnsi"/>
@@ -8231,7 +8319,7 @@
           <w:lang w:eastAsia="en-GB"/>
         </w:rPr>
       </w:pPr>
-      <w:bookmarkStart w:id="10" w:name="_Toc233543220"/>
+      <w:bookmarkStart w:id="10" w:name="_Toc233637727"/>
       <w:r>
         <w:rPr>
           <w:lang w:eastAsia="en-GB"/>
@@ -8430,7 +8518,7 @@
           <w:lang w:eastAsia="en-GB"/>
         </w:rPr>
       </w:pPr>
-      <w:bookmarkStart w:id="13" w:name="_Toc233543221"/>
+      <w:bookmarkStart w:id="13" w:name="_Toc233637728"/>
       <w:r>
         <w:rPr>
           <w:lang w:eastAsia="en-GB"/>
@@ -8542,7 +8630,7 @@
           <w:lang w:eastAsia="en-GB"/>
         </w:rPr>
       </w:pPr>
-      <w:bookmarkStart w:id="14" w:name="_Toc233543222"/>
+      <w:bookmarkStart w:id="14" w:name="_Toc233637729"/>
       <w:r>
         <w:rPr>
           <w:lang w:eastAsia="en-GB"/>
@@ -9374,7 +9462,7 @@
           <w:lang w:eastAsia="en-GB"/>
         </w:rPr>
       </w:pPr>
-      <w:bookmarkStart w:id="21" w:name="_Toc233543223"/>
+      <w:bookmarkStart w:id="21" w:name="_Toc233637730"/>
       <w:r>
         <w:rPr>
           <w:lang w:eastAsia="en-GB"/>
@@ -9539,7 +9627,7 @@
           <w:lang w:eastAsia="en-GB"/>
         </w:rPr>
       </w:pPr>
-      <w:bookmarkStart w:id="22" w:name="_Toc233543224"/>
+      <w:bookmarkStart w:id="22" w:name="_Toc233637731"/>
       <w:r>
         <w:rPr>
           <w:lang w:eastAsia="en-GB"/>
@@ -9637,7 +9725,7 @@
           <w:lang w:eastAsia="en-GB"/>
         </w:rPr>
       </w:pPr>
-      <w:bookmarkStart w:id="23" w:name="_Toc233543225"/>
+      <w:bookmarkStart w:id="23" w:name="_Toc233637732"/>
       <w:r>
         <w:rPr>
           <w:lang w:eastAsia="en-GB"/>
@@ -10307,8 +10395,8 @@
           <w:lang w:eastAsia="en-GB"/>
         </w:rPr>
       </w:pPr>
-      <w:bookmarkStart w:id="27" w:name="_Toc233543226"/>
-      <w:bookmarkStart w:id="28" w:name="_Ref233543378"/>
+      <w:bookmarkStart w:id="27" w:name="_Ref233543378"/>
+      <w:bookmarkStart w:id="28" w:name="_Toc233637733"/>
       <w:r>
         <w:rPr>
           <w:lang w:eastAsia="en-GB"/>
@@ -10803,7 +10891,7 @@
           <w:lang w:eastAsia="en-GB"/>
         </w:rPr>
       </w:pPr>
-      <w:bookmarkStart w:id="31" w:name="_Toc233543227"/>
+      <w:bookmarkStart w:id="31" w:name="_Toc233637734"/>
       <w:r>
         <w:rPr>
           <w:lang w:eastAsia="en-GB"/>
@@ -11172,7 +11260,7 @@
           <w:lang w:eastAsia="en-GB"/>
         </w:rPr>
       </w:pPr>
-      <w:bookmarkStart w:id="32" w:name="_Toc233543228"/>
+      <w:bookmarkStart w:id="32" w:name="_Toc233637735"/>
       <w:r>
         <w:rPr>
           <w:lang w:eastAsia="en-GB"/>
@@ -11429,7 +11517,7 @@
           <w:lang w:eastAsia="en-GB"/>
         </w:rPr>
       </w:pPr>
-      <w:bookmarkStart w:id="33" w:name="_Toc233543229"/>
+      <w:bookmarkStart w:id="33" w:name="_Toc233637736"/>
       <w:r>
         <w:rPr>
           <w:lang w:eastAsia="en-GB"/>
@@ -11461,7 +11549,19 @@
         <w:rPr>
           <w:lang w:eastAsia="en-GB"/>
         </w:rPr>
-        <w:t>The only difference in its implementation, cf. Latch1, is that it will use ID_TMP2 and IS_TMP2 rather than using ID_TMP1 and IS_TEM1.</w:t>
+        <w:t>The only difference in its implementation, cf. Latch1, is that it will use ID_TMP2 and IS_TMP2 rather than using ID_TMP1 and IS_TEM</w:t>
+      </w:r>
+      <w:r>
+        <w:rPr>
+          <w:lang w:eastAsia="en-GB"/>
+        </w:rPr>
+        <w:t>P</w:t>
+      </w:r>
+      <w:r>
+        <w:rPr>
+          <w:lang w:eastAsia="en-GB"/>
+        </w:rPr>
+        <w:t>1.</w:t>
       </w:r>
     </w:p>
     <w:p>
@@ -11490,7 +11590,7 @@
           <w:lang w:eastAsia="en-GB"/>
         </w:rPr>
       </w:pPr>
-      <w:bookmarkStart w:id="34" w:name="_Toc233543230"/>
+      <w:bookmarkStart w:id="34" w:name="_Toc233637737"/>
       <w:r>
         <w:rPr>
           <w:lang w:eastAsia="en-GB"/>
@@ -11584,10 +11684,72 @@
     </w:p>
     <w:p>
       <w:pPr>
-        <w:rPr>
-          <w:lang w:eastAsia="en-GB"/>
-        </w:rPr>
-      </w:pPr>
+        <w:pStyle w:val="Heading1"/>
+        <w:rPr>
+          <w:lang w:eastAsia="en-GB"/>
+        </w:rPr>
+      </w:pPr>
+      <w:bookmarkStart w:id="35" w:name="_Toc233637738"/>
+      <w:r>
+        <w:rPr>
+          <w:lang w:eastAsia="en-GB"/>
+        </w:rPr>
+        <w:t xml:space="preserve">L2 Design </w:t>
+      </w:r>
+      <w:proofErr w:type="gramStart"/>
+      <w:r>
+        <w:rPr>
+          <w:lang w:eastAsia="en-GB"/>
+        </w:rPr>
+        <w:t>For</w:t>
+      </w:r>
+      <w:proofErr w:type="gramEnd"/>
+      <w:r>
+        <w:rPr>
+          <w:lang w:eastAsia="en-GB"/>
+        </w:rPr>
+        <w:t xml:space="preserve"> Sequence Control</w:t>
+      </w:r>
+      <w:bookmarkEnd w:id="35"/>
+    </w:p>
+    <w:p>
+      <w:pPr>
+        <w:rPr>
+          <w:lang w:eastAsia="en-GB"/>
+        </w:rPr>
+      </w:pPr>
+      <w:r>
+        <w:rPr>
+          <w:lang w:eastAsia="en-GB"/>
+        </w:rPr>
+        <w:t>&lt;</w:t>
+      </w:r>
+      <w:proofErr w:type="spellStart"/>
+      <w:r>
+        <w:rPr>
+          <w:lang w:eastAsia="en-GB"/>
+        </w:rPr>
+        <w:t>tbd</w:t>
+      </w:r>
+      <w:proofErr w:type="spellEnd"/>
+      <w:r>
+        <w:rPr>
+          <w:lang w:eastAsia="en-GB"/>
+        </w:rPr>
+        <w:t xml:space="preserve"> this section needs writing</w:t>
+      </w:r>
+      <w:r>
+        <w:rPr>
+          <w:lang w:eastAsia="en-GB"/>
+        </w:rPr>
+        <w:tab/>
+      </w:r>
+      <w:r>
+        <w:rPr>
+          <w:lang w:eastAsia="en-GB"/>
+        </w:rPr>
+        <w:t>&gt;</w:t>
+      </w:r>
     </w:p>
     <w:p>
       <w:pPr>
@@ -11629,7 +11791,7 @@
           <w:lang w:eastAsia="en-GB"/>
         </w:rPr>
       </w:pPr>
-      <w:bookmarkStart w:id="35" w:name="_Toc233543231"/>
+      <w:bookmarkStart w:id="36" w:name="_Toc233637739"/>
       <w:r>
         <w:rPr>
           <w:lang w:eastAsia="en-GB"/>
@@ -11638,9 +11800,9 @@
         <w:t>References</w:t>
       </w:r>
       <w:bookmarkEnd w:id="20"/>
-      <w:bookmarkEnd w:id="35"/>
+      <w:bookmarkEnd w:id="36"/>
     </w:p>
-    <w:bookmarkStart w:id="36" w:name="AVR_Instruction_Doc"/>
+    <w:bookmarkStart w:id="37" w:name="AVR_Instruction_Doc"/>
     <w:p>
       <w:pPr>
         <w:pStyle w:val="ListParagraph"/>
@@ -11677,7 +11839,7 @@
         </w:rPr>
         <w:t>AVR Instruction Set Manual</w:t>
       </w:r>
-      <w:bookmarkEnd w:id="36"/>
+      <w:bookmarkEnd w:id="37"/>
       <w:r>
         <w:rPr>
           <w:lang w:eastAsia="en-GB"/>
@@ -11685,7 +11847,7 @@
         <w:fldChar w:fldCharType="end"/>
       </w:r>
     </w:p>
-    <w:bookmarkStart w:id="37" w:name="RefCpuDesign"/>
+    <w:bookmarkStart w:id="38" w:name="RefCpuDesign"/>
     <w:p>
       <w:pPr>
         <w:pStyle w:val="ListParagraph"/>
@@ -11722,7 +11884,7 @@
         </w:rPr>
         <w:t>CpuDesign.docx</w:t>
       </w:r>
-      <w:bookmarkEnd w:id="37"/>
+      <w:bookmarkEnd w:id="38"/>
       <w:r>
         <w:rPr>
           <w:lang w:eastAsia="en-GB"/>
@@ -11730,7 +11892,7 @@
         <w:fldChar w:fldCharType="end"/>
       </w:r>
     </w:p>
-    <w:bookmarkStart w:id="38" w:name="RefL1SeqXlsx"/>
+    <w:bookmarkStart w:id="39" w:name="RefL1SeqXlsx"/>
     <w:p>
       <w:pPr>
         <w:pStyle w:val="ListParagraph"/>
@@ -11773,9 +11935,9 @@
         </w:rPr>
         <w:fldChar w:fldCharType="end"/>
       </w:r>
-      <w:bookmarkEnd w:id="38"/>
+      <w:bookmarkEnd w:id="39"/>
     </w:p>
-    <w:bookmarkStart w:id="39" w:name="RefOpcodeFormat"/>
+    <w:bookmarkStart w:id="40" w:name="RefOpcodeFormat"/>
     <w:p>
       <w:pPr>
         <w:pStyle w:val="ListParagraph"/>
@@ -11828,7 +11990,7 @@
         </w:rPr>
         <w:t xml:space="preserve"> - proposed new format.xlsx</w:t>
       </w:r>
-      <w:bookmarkEnd w:id="39"/>
+      <w:bookmarkEnd w:id="40"/>
       <w:r>
         <w:rPr>
           <w:lang w:eastAsia="en-GB"/>
@@ -11975,7 +12137,7 @@
               <w:b/>
               <w:noProof/>
             </w:rPr>
-            <w:t>4</w:t>
+            <w:t>10</w:t>
           </w:r>
         </w:fldSimple>
       </w:p>
@@ -17137,7 +17299,7 @@
 </file>
 
 <file path=customXml/itemProps2.xml><?xml version="1.0" encoding="utf-8"?>
-<ds:datastoreItem xmlns:ds="http://schemas.openxmlformats.org/officeDocument/2006/customXml" ds:itemID="{DB12F4C5-28EB-4B95-8821-AB00BE82ABB4}">
+<ds:datastoreItem xmlns:ds="http://schemas.openxmlformats.org/officeDocument/2006/customXml" ds:itemID="{0BEED128-DCE6-432A-9B46-259153CCB305}">
   <ds:schemaRefs>
     <ds:schemaRef ds:uri="http://schemas.openxmlformats.org/officeDocument/2006/bibliography"/>
   </ds:schemaRefs>

</xml_diff>